<commit_message>
Correct the ranking claim and three smaller statements
The five worst vintages are the same as the raw ranking at 60 and 84
months, not under every reading: at 36 months FY2009 climbs to fourth
and FY2004 drops to seventh. The 0.92-0.96 was the correlation between
the three ages; against the raw ranking it is 0.86 at 36 months and
0.91-0.96 at 60 and 84. Figure 3 now draws FY2009, and graficos.py
asserts both facts.

Also made exact: the share of loss still ahead at five years (43%, not
half), what the 18% understatement for FY2020-21 refers to, the period
behind the loss rates by term, and twelve (not thirteen) vintages below
4.24 cents. Deliverables and the technical report regenerated.

Co-Authored-By: Claude Opus 5.5 (1M context) <noreply@anthropic.com>
</commit_message>
<xml_diff>
--- a/entregables/resumen_ejecutivo.docx
+++ b/entregables/resumen_ejecutivo.docx
@@ -88,7 +88,7 @@
           <w:color w:val="1A1815"/>
           <w:sz w:val="22"/>
         </w:rPr>
-        <w:t>Across the twenty-four vintages old enough to have finished, only 23.5% of eventual charge-offs have occurred by month 36. The median default lands at month 58 — year five, not year three. Half the loss is still ahead at the five-year mark.</w:t>
+        <w:t>Across the twenty-four vintages old enough to have finished, only 23.5% of eventual charge-offs have occurred by month 36. The median default lands at month 58 — year five, not year three. More than two-fifths of the loss is still ahead at the five-year mark.</w:t>
       </w:r>
     </w:p>
     <w:p>
@@ -162,7 +162,7 @@
           <w:color w:val="1A1815"/>
           <w:sz w:val="22"/>
         </w:rPr>
-        <w:t>It has recorded 0.75 cents of loss per dollar approved, which reads as excellent. Corrected for age it projects to 4.24 cents, with an interquartile band of 3.28 to 6.18. Thirteen consecutive vintages, 2011 through 2022, landed below that. In loan-count terms the same vintage moves from 3.5% to 12.2%. The 2024 and 2025 books are published as a labelled gap rather than a number: they have realised 5.9% and 0.2% of their eventual loss, and multiplying those up would produce a confident-looking figure resting on almost nothing.</w:t>
+        <w:t>It has recorded 0.75 cents of loss per dollar approved, which reads as excellent. Corrected for age it projects to 4.24 cents, with an interquartile band of 3.28 to 6.18. Twelve consecutive vintages, 2011 through 2022, landed below that. In loan-count terms the same vintage moves from 3.5% to 12.2%. The 2024 and 2025 books are published as a labelled gap rather than a number: they have realised 5.9% and 0.2% of their eventual loss, and multiplying those up would produce a confident-looking figure resting on almost nothing.</w:t>
       </w:r>
     </w:p>
     <w:p>
@@ -236,7 +236,7 @@
           <w:color w:val="1A1815"/>
           <w:sz w:val="22"/>
         </w:rPr>
-        <w:t>At the same age they default at roughly half the rate of every neighbouring vintage — 0.85% and 0.77% against 1.58% to 1.98%. Under CARES Act section 1112 the government was paying instalments on many of these loans. A model calibrated on those two years understates everything else by about 18%.</w:t>
+        <w:t>At the same age they default at roughly half the rate of every neighbouring vintage — 0.85% and 0.77% against 1.58% to 1.98%. Under CARES Act section 1112 the government was paying instalments on many of these loans. Added to a 2016–2019 calibration sample, those two years pull its rate at 36 months from 1.83% to 1.49% — about 18% too low.</w:t>
       </w:r>
     </w:p>
     <w:p>
@@ -310,7 +310,7 @@
           <w:color w:val="1A1815"/>
           <w:sz w:val="22"/>
         </w:rPr>
-        <w:t>The five worst vintages are the same whether you read raw rates or rates at equal age. The mistake a fund makes is not picking the wrong worst year — it is believing a young year’s number.</w:t>
+        <w:t>At five and seven years the five worst vintages are the same whether you read raw rates or rates at equal age; at three years one swaps places. The mistake a fund makes is not picking the wrong worst year — it is believing a young year’s number.</w:t>
       </w:r>
     </w:p>
     <w:p>
@@ -384,7 +384,7 @@
           <w:color w:val="1A1815"/>
           <w:sz w:val="22"/>
         </w:rPr>
-        <w:t>At 60 months, loans of seven years or less charge off at 5.67% against 0.39% for loans over twenty years. That is where the loss sits — though term is a proxy for product and collateral, so it is a statement about which business you are in, not a lever to pull.</w:t>
+        <w:t>At 60 months, averaged across the 2010–2019 vintages, loans of seven years or less charge off at 5.67% against 0.39% for loans over twenty years. That is where the loss sits — though term is a proxy for product and collateral, so it is a statement about which business you are in, not a lever to pull.</w:t>
       </w:r>
     </w:p>
     <w:p>

</xml_diff>